<commit_message>
feat(oportunidades): campo Actividad Comercial integrado con el sistema de Actividades
- Nuevo campo 'Actividad Comercial' (Visita comercial / Informe de alternativas / Propuesta de servicios), desplegable, en la oportunidad
- Convive con Estado (no lo reemplaza)
- Al seleccionar/cambiar la actividad (drawer o inline en la grilla) se registra automáticamente en Actividades de la Cuenta y del Contacto + Timeline, reutilizando el modelo existente (sin duplicar)
- Nueva columna 'Actividad Comercial' editable en la grilla, filtro dedicado y 3 widgets como filtros rápidos
- Guía Oportunidades v1.1; verificado con node --check + harness top-level (login intacto)
</commit_message>
<xml_diff>
--- a/docs/manuales/Guia_Oportunidades.docx
+++ b/docs/manuales/Guia_Oportunidades.docx
@@ -80,7 +80,7 @@
           <w:color w:val="56648F"/>
           <w:sz w:val="21"/>
         </w:rPr>
-        <w:t>Versión 1.0   ·   23/07/2026</w:t>
+        <w:t>Versión 1.1   ·   23/07/2026</w:t>
       </w:r>
     </w:p>
     <w:p/>
@@ -298,6 +298,39 @@
     <w:p>
       <w:r>
         <w:t>Ejecutivo responsable de la oportunidad (obligatorio).</w:t>
+      </w:r>
+    </w:p>
+    <w:p>
+      <w:r>
+        <w:rPr>
+          <w:color w:val="C9D6F0"/>
+        </w:rPr>
+        <w:t>──────────────────────────────────────────────</w:t>
+      </w:r>
+    </w:p>
+    <w:p>
+      <w:r>
+        <w:rPr>
+          <w:b/>
+          <w:color w:val="00285A"/>
+          <w:sz w:val="23"/>
+        </w:rPr>
+        <w:t>Actividad Comercial</w:t>
+      </w:r>
+    </w:p>
+    <w:p>
+      <w:r>
+        <w:rPr>
+          <w:b/>
+          <w:color w:val="1C54F4"/>
+          <w:sz w:val="21"/>
+        </w:rPr>
+        <w:t>Qué ingresar:</w:t>
+      </w:r>
+    </w:p>
+    <w:p>
+      <w:r>
+        <w:t>Acción comercial más relevante en curso: Visita comercial, Informe de alternativas o Propuesta de servicios. Al elegirla o cambiarla se registra automáticamente esa actividad en la Cuenta y el Contacto. Convive con el Estado (no lo reemplaza).</w:t>
       </w:r>
     </w:p>
     <w:p>

</xml_diff>

<commit_message>
feat(oportunidades): Prioridad (Baja/Media/Alta) reemplaza los porcentajes de probabilidad
- Nuevo atributo independiente 'prioridad' (Baja/Media/Alta), sin porcentajes.
  Selector en el drawer (por default Media) e inline en la grilla; sin valores libres.
- Vista general: columna 'Prioridad' con badges 🟢 Alta / 🟡 Media / ⚪ Baja
  (reemplaza la columna de % Probabilidad). Filtro 'Prioridad' reemplaza '% Conversión'.
- Analytics/Dashboard: 'Distribución de oportunidades' y 'Por Prioridad' pasan a
  las tres categorías; se retiran todos los porcentajes de la UI.
- Estados (En gestión/En negociación/Ganada/Perdida), automatizaciones, actividades
  y cierre→Transacción sin cambios. Modelo: se agrega 'prioridad'; datos legacy sin
  prioridad se derivan del bucket previo de conversión (Alta/Media/Baja). oppUpdatePrioridad.
- Guia Oportunidades v2.1.
</commit_message>
<xml_diff>
--- a/docs/manuales/Guia_Oportunidades.docx
+++ b/docs/manuales/Guia_Oportunidades.docx
@@ -80,7 +80,7 @@
           <w:color w:val="56648F"/>
           <w:sz w:val="21"/>
         </w:rPr>
-        <w:t>Versión 2.0   ·   23/07/2026</w:t>
+        <w:t>Versión 2.1   ·   23/07/2026</w:t>
       </w:r>
     </w:p>
     <w:p/>
@@ -249,7 +249,7 @@
           <w:color w:val="00285A"/>
           <w:sz w:val="23"/>
         </w:rPr>
-        <w:t>Probabilidad</w:t>
+        <w:t>Prioridad</w:t>
       </w:r>
     </w:p>
     <w:p>
@@ -264,7 +264,7 @@
     </w:p>
     <w:p>
       <w:r>
-        <w:t>Ya NO se elige por separado: queda implícita según el estado. En gestión = 0–50%, En negociación = 51–80%, Ganada = 100%, Perdida = 0%.</w:t>
+        <w:t>Atributo independiente del estado, con tres niveles: 🟢 Alta, 🟡 Media o ⚪ Baja. Reemplaza a los porcentajes de probabilidad (ya no se usan). Se elige del desplegable y se puede cambiar desde la grilla; se muestra como etiqueta en la lista y en Analytics.</w:t>
       </w:r>
     </w:p>
     <w:p>

</xml_diff>

<commit_message>
feat(oportunidades): Probabilidad de cierre reemplaza a Prioridad (4 niveles, solo Gerente)
- Campo único Probabilidad (Muy baja/Baja/Media/Alta), sin porcentajes ni "Prioridad"
- Estado asigna default inicial (En gestión→Muy baja, En negociación→Media); editable por Gerente
- Broker no visualiza ni edita Probabilidad; Gerente/Admin sí (columna, filtro, ficha, drawer)
- Badges Nexus: 🔴 Muy baja / 🟠 Baja / 🟡 Media / 🟢 Alta en grilla, ficha y Analytics
- Analytics ("Por Probabilidad") y timeline actualizados a la clasificación de 4 valores
- Compat legacy: deriva de prioridad previa o del estado; elimina badge de porcentajes muerto
- Guía Oportunidades v3.1 regenerada (DOCX+PDF)

Co-Authored-By: Claude Opus 4.8 <noreply@anthropic.com>
Claude-Session: https://claude.ai/code/session_01JkU9BrFwXYbLVUvW55gcE9
</commit_message>
<xml_diff>
--- a/docs/manuales/Guia_Oportunidades.docx
+++ b/docs/manuales/Guia_Oportunidades.docx
@@ -80,7 +80,7 @@
           <w:color w:val="56648F"/>
           <w:sz w:val="21"/>
         </w:rPr>
-        <w:t>Versión 3.0   ·   23/07/2026</w:t>
+        <w:t>Versión 3.1   ·   23/07/2026</w:t>
       </w:r>
     </w:p>
     <w:p/>
@@ -249,7 +249,7 @@
           <w:color w:val="00285A"/>
           <w:sz w:val="23"/>
         </w:rPr>
-        <w:t>Prioridad</w:t>
+        <w:t>Probabilidad</w:t>
       </w:r>
     </w:p>
     <w:p>
@@ -264,7 +264,7 @@
     </w:p>
     <w:p>
       <w:r>
-        <w:t>Atributo independiente del estado, con tres niveles: 🟢 Alta, 🟡 Media o ⚪ Baja. Reemplaza a los porcentajes de probabilidad (ya no se usan). Se elige del desplegable y se puede cambiar desde la grilla; se muestra como etiqueta en la lista y en Analytics.</w:t>
+        <w:t>Probabilidad de cierre de la oportunidad, con cuatro niveles: 🔴 Muy baja, 🟠 Baja, 🟡 Media o 🟢 Alta (sin porcentajes). El Estado le asigna un valor inicial (En gestión → Muy baja, En negociación → Media), pero es un atributo independiente que el Gerente Comercial puede modificar. Solo la visualizan y editan el Gerente Comercial y el Administrador; el Broker no la ve ni la edita. Se muestra como etiqueta en la grilla, en la ficha y en Analytics.</w:t>
       </w:r>
     </w:p>
     <w:p>

</xml_diff>